<commit_message>
added github link to readme file
</commit_message>
<xml_diff>
--- a/booking-system/README.docx
+++ b/booking-system/README.docx
@@ -449,6 +449,10 @@
     <w:sdt>
       <w:sdtPr>
         <w:rPr>
+          <w:rFonts w:asciiTheme="minorHAnsi" w:eastAsiaTheme="minorHAnsi" w:hAnsiTheme="minorHAnsi" w:cstheme="minorBidi"/>
+          <w:color w:val="auto"/>
+          <w:sz w:val="22"/>
+          <w:szCs w:val="22"/>
           <w:rtl/>
         </w:rPr>
         <w:id w:val="-533110704"/>
@@ -459,13 +463,9 @@
       </w:sdtPr>
       <w:sdtEndPr>
         <w:rPr>
-          <w:rFonts w:asciiTheme="minorHAnsi" w:eastAsiaTheme="minorHAnsi" w:hAnsiTheme="minorHAnsi" w:cstheme="minorBidi"/>
           <w:b/>
           <w:bCs/>
           <w:noProof/>
-          <w:color w:val="auto"/>
-          <w:sz w:val="22"/>
-          <w:szCs w:val="22"/>
         </w:rPr>
       </w:sdtEndPr>
       <w:sdtContent>
@@ -2935,7 +2935,7 @@
         </w:tabs>
         <w:bidi/>
         <w:rPr>
-          <w:rFonts w:cs="B Nazanin" w:hint="cs"/>
+          <w:rFonts w:cs="B Nazanin"/>
           <w:sz w:val="28"/>
           <w:szCs w:val="28"/>
           <w:rtl/>
@@ -3020,6 +3020,7 @@
           <w:rFonts w:cs="B Nazanin"/>
           <w:sz w:val="28"/>
           <w:szCs w:val="28"/>
+          <w:rtl/>
           <w:lang w:bidi="fa-IR"/>
         </w:rPr>
       </w:pPr>
@@ -3034,17 +3035,6 @@
     </w:p>
     <w:p>
       <w:pPr>
-        <w:bidi/>
-        <w:rPr>
-          <w:rFonts w:cs="B Nazanin"/>
-          <w:sz w:val="28"/>
-          <w:szCs w:val="28"/>
-          <w:rtl/>
-        </w:rPr>
-      </w:pPr>
-    </w:p>
-    <w:p>
-      <w:pPr>
         <w:pStyle w:val="Heading1"/>
         <w:bidi/>
         <w:rPr>
@@ -3308,14 +3298,55 @@
     </w:p>
     <w:p>
       <w:pPr>
-        <w:bidi/>
-        <w:rPr>
-          <w:rFonts w:cs="B Nazanin"/>
-          <w:sz w:val="28"/>
-          <w:szCs w:val="28"/>
-          <w:rtl/>
-        </w:rPr>
-      </w:pPr>
+        <w:jc w:val="right"/>
+        <w:rPr>
+          <w:rFonts w:cs="B Nazanin"/>
+          <w:sz w:val="28"/>
+          <w:szCs w:val="28"/>
+          <w:rtl/>
+          <w:lang w:bidi="fa-IR"/>
+        </w:rPr>
+      </w:pPr>
+      <w:r>
+        <w:rPr>
+          <w:rFonts w:cs="B Nazanin" w:hint="cs"/>
+          <w:sz w:val="28"/>
+          <w:szCs w:val="28"/>
+          <w:rtl/>
+          <w:lang w:bidi="fa-IR"/>
+        </w:rPr>
+        <w:t xml:space="preserve">یا از طریق لینک زیر، پروژه را دریافت کنید: </w:t>
+      </w:r>
+    </w:p>
+    <w:p>
+      <w:pPr>
+        <w:rPr>
+          <w:rFonts w:cs="B Nazanin"/>
+          <w:sz w:val="28"/>
+          <w:szCs w:val="28"/>
+          <w:rtl/>
+          <w:lang w:bidi="fa-IR"/>
+        </w:rPr>
+      </w:pPr>
+      <w:r>
+        <w:rPr>
+          <w:rFonts w:cs="B Nazanin"/>
+          <w:sz w:val="28"/>
+          <w:szCs w:val="28"/>
+          <w:rtl/>
+          <w:lang w:bidi="fa-IR"/>
+        </w:rPr>
+        <w:br/>
+      </w:r>
+      <w:r>
+        <w:rPr>
+          <w:rFonts w:cs="B Nazanin"/>
+          <w:sz w:val="28"/>
+          <w:szCs w:val="28"/>
+          <w:lang w:bidi="fa-IR"/>
+        </w:rPr>
+        <w:t>https://github.com/nioovns/booking-system</w:t>
+      </w:r>
     </w:p>
     <w:p>
       <w:pPr>
@@ -3494,36 +3525,8 @@
           <w:sz w:val="28"/>
           <w:szCs w:val="28"/>
         </w:rPr>
-        <w:t xml:space="preserve">python -m </w:t>
-      </w:r>
-      <w:proofErr w:type="spellStart"/>
-      <w:r>
-        <w:rPr>
-          <w:rFonts w:cs="B Nazanin"/>
-          <w:sz w:val="28"/>
-          <w:szCs w:val="28"/>
-        </w:rPr>
-        <w:t>venv</w:t>
-      </w:r>
-      <w:proofErr w:type="spellEnd"/>
-      <w:r>
-        <w:rPr>
-          <w:rFonts w:cs="B Nazanin"/>
-          <w:sz w:val="28"/>
-          <w:szCs w:val="28"/>
-        </w:rPr>
-        <w:t xml:space="preserve"> </w:t>
-      </w:r>
-      <w:proofErr w:type="spellStart"/>
-      <w:r>
-        <w:rPr>
-          <w:rFonts w:cs="B Nazanin"/>
-          <w:sz w:val="28"/>
-          <w:szCs w:val="28"/>
-        </w:rPr>
-        <w:t>venv</w:t>
-      </w:r>
-      <w:proofErr w:type="spellEnd"/>
+        <w:t>python -m venv venv</w:t>
+      </w:r>
     </w:p>
     <w:p>
       <w:pPr>
@@ -3608,23 +3611,13 @@
           <w:rtl/>
         </w:rPr>
       </w:pPr>
-      <w:proofErr w:type="spellStart"/>
-      <w:r>
-        <w:rPr>
-          <w:rFonts w:cs="B Nazanin"/>
-          <w:sz w:val="28"/>
-          <w:szCs w:val="28"/>
-        </w:rPr>
-        <w:t>venv</w:t>
-      </w:r>
-      <w:proofErr w:type="spellEnd"/>
-      <w:r>
-        <w:rPr>
-          <w:rFonts w:cs="B Nazanin"/>
-          <w:sz w:val="28"/>
-          <w:szCs w:val="28"/>
-        </w:rPr>
-        <w:t>\Scripts\activate</w:t>
+      <w:r>
+        <w:rPr>
+          <w:rFonts w:cs="B Nazanin"/>
+          <w:sz w:val="28"/>
+          <w:szCs w:val="28"/>
+        </w:rPr>
+        <w:t>venv\Scripts\activate</w:t>
       </w:r>
     </w:p>
     <w:p>
@@ -3738,36 +3731,8 @@
           <w:sz w:val="28"/>
           <w:szCs w:val="28"/>
         </w:rPr>
-        <w:t xml:space="preserve">python3 -m </w:t>
-      </w:r>
-      <w:proofErr w:type="spellStart"/>
-      <w:r>
-        <w:rPr>
-          <w:rFonts w:cs="B Nazanin"/>
-          <w:sz w:val="28"/>
-          <w:szCs w:val="28"/>
-        </w:rPr>
-        <w:t>venv</w:t>
-      </w:r>
-      <w:proofErr w:type="spellEnd"/>
-      <w:r>
-        <w:rPr>
-          <w:rFonts w:cs="B Nazanin"/>
-          <w:sz w:val="28"/>
-          <w:szCs w:val="28"/>
-        </w:rPr>
-        <w:t xml:space="preserve"> </w:t>
-      </w:r>
-      <w:proofErr w:type="spellStart"/>
-      <w:r>
-        <w:rPr>
-          <w:rFonts w:cs="B Nazanin"/>
-          <w:sz w:val="28"/>
-          <w:szCs w:val="28"/>
-        </w:rPr>
-        <w:t>venv</w:t>
-      </w:r>
-      <w:proofErr w:type="spellEnd"/>
+        <w:t>python3 -m venv venv</w:t>
+      </w:r>
     </w:p>
     <w:p>
       <w:pPr>
@@ -3857,25 +3822,7 @@
           <w:sz w:val="28"/>
           <w:szCs w:val="28"/>
         </w:rPr>
-        <w:t xml:space="preserve">source </w:t>
-      </w:r>
-      <w:proofErr w:type="spellStart"/>
-      <w:r>
-        <w:rPr>
-          <w:rFonts w:cs="B Nazanin"/>
-          <w:sz w:val="28"/>
-          <w:szCs w:val="28"/>
-        </w:rPr>
-        <w:t>venv</w:t>
-      </w:r>
-      <w:proofErr w:type="spellEnd"/>
-      <w:r>
-        <w:rPr>
-          <w:rFonts w:cs="B Nazanin"/>
-          <w:sz w:val="28"/>
-          <w:szCs w:val="28"/>
-        </w:rPr>
-        <w:t>/bin/activate</w:t>
+        <w:t>source venv/bin/activate</w:t>
       </w:r>
     </w:p>
     <w:p>
@@ -3958,25 +3905,7 @@
           <w:sz w:val="28"/>
           <w:szCs w:val="28"/>
         </w:rPr>
-        <w:t xml:space="preserve"> `(</w:t>
-      </w:r>
-      <w:proofErr w:type="spellStart"/>
-      <w:r>
-        <w:rPr>
-          <w:rFonts w:cs="B Nazanin"/>
-          <w:sz w:val="28"/>
-          <w:szCs w:val="28"/>
-        </w:rPr>
-        <w:t>venv</w:t>
-      </w:r>
-      <w:proofErr w:type="spellEnd"/>
-      <w:r>
-        <w:rPr>
-          <w:rFonts w:cs="B Nazanin"/>
-          <w:sz w:val="28"/>
-          <w:szCs w:val="28"/>
-        </w:rPr>
-        <w:t xml:space="preserve">)` </w:t>
+        <w:t xml:space="preserve"> `(venv)` </w:t>
       </w:r>
       <w:r>
         <w:rPr>
@@ -4234,18 +4163,8 @@
           <w:sz w:val="28"/>
           <w:szCs w:val="28"/>
         </w:rPr>
-        <w:t>cd booking-system/</w:t>
-      </w:r>
-      <w:proofErr w:type="spellStart"/>
-      <w:r>
-        <w:rPr>
-          <w:rFonts w:cs="B Nazanin"/>
-          <w:sz w:val="28"/>
-          <w:szCs w:val="28"/>
-        </w:rPr>
-        <w:t>bookingsys</w:t>
-      </w:r>
-      <w:proofErr w:type="spellEnd"/>
+        <w:t>cd booking-system/bookingsys</w:t>
+      </w:r>
     </w:p>
     <w:p>
       <w:pPr>
@@ -4335,18 +4254,8 @@
           <w:sz w:val="28"/>
           <w:szCs w:val="28"/>
         </w:rPr>
-        <w:t xml:space="preserve">python manage.py </w:t>
-      </w:r>
-      <w:proofErr w:type="spellStart"/>
-      <w:r>
-        <w:rPr>
-          <w:rFonts w:cs="B Nazanin"/>
-          <w:sz w:val="28"/>
-          <w:szCs w:val="28"/>
-        </w:rPr>
-        <w:t>makemigrations</w:t>
-      </w:r>
-      <w:proofErr w:type="spellEnd"/>
+        <w:t>python manage.py makemigrations</w:t>
+      </w:r>
     </w:p>
     <w:p>
       <w:pPr>
@@ -4465,18 +4374,8 @@
           <w:sz w:val="28"/>
           <w:szCs w:val="28"/>
         </w:rPr>
-        <w:t xml:space="preserve">python manage.py </w:t>
-      </w:r>
-      <w:proofErr w:type="spellStart"/>
-      <w:r>
-        <w:rPr>
-          <w:rFonts w:cs="B Nazanin"/>
-          <w:sz w:val="28"/>
-          <w:szCs w:val="28"/>
-        </w:rPr>
-        <w:t>createsuperuser</w:t>
-      </w:r>
-      <w:proofErr w:type="spellEnd"/>
+        <w:t>python manage.py createsuperuser</w:t>
+      </w:r>
     </w:p>
     <w:p>
       <w:pPr>
@@ -4582,18 +4481,8 @@
           <w:sz w:val="28"/>
           <w:szCs w:val="28"/>
         </w:rPr>
-        <w:t xml:space="preserve">python manage.py </w:t>
-      </w:r>
-      <w:proofErr w:type="spellStart"/>
-      <w:r>
-        <w:rPr>
-          <w:rFonts w:cs="B Nazanin"/>
-          <w:sz w:val="28"/>
-          <w:szCs w:val="28"/>
-        </w:rPr>
-        <w:t>runserver</w:t>
-      </w:r>
-      <w:proofErr w:type="spellEnd"/>
+        <w:t>python manage.py runserver</w:t>
+      </w:r>
     </w:p>
     <w:p>
       <w:pPr>
@@ -4697,7 +4586,6 @@
           <w:rtl/>
         </w:rPr>
       </w:pPr>
-      <w:proofErr w:type="spellStart"/>
       <w:r>
         <w:rPr>
           <w:rFonts w:cs="B Nazanin"/>
@@ -4706,7 +4594,6 @@
         </w:rPr>
         <w:t>ReDoc</w:t>
       </w:r>
-      <w:proofErr w:type="spellEnd"/>
       <w:r>
         <w:rPr>
           <w:rFonts w:cs="B Nazanin"/>
@@ -5165,25 +5052,7 @@
           <w:sz w:val="28"/>
           <w:szCs w:val="28"/>
         </w:rPr>
-        <w:t xml:space="preserve"> POST /</w:t>
-      </w:r>
-      <w:proofErr w:type="spellStart"/>
-      <w:r>
-        <w:rPr>
-          <w:rFonts w:cs="B Nazanin"/>
-          <w:sz w:val="28"/>
-          <w:szCs w:val="28"/>
-        </w:rPr>
-        <w:t>api</w:t>
-      </w:r>
-      <w:proofErr w:type="spellEnd"/>
-      <w:r>
-        <w:rPr>
-          <w:rFonts w:cs="B Nazanin"/>
-          <w:sz w:val="28"/>
-          <w:szCs w:val="28"/>
-        </w:rPr>
-        <w:t xml:space="preserve">/users/register/ </w:t>
+        <w:t xml:space="preserve"> POST /api/users/register/ </w:t>
       </w:r>
       <w:r>
         <w:rPr>
@@ -5407,18 +5276,95 @@
           <w:sz w:val="28"/>
           <w:szCs w:val="28"/>
         </w:rPr>
-        <w:t xml:space="preserve">  "username": "</w:t>
-      </w:r>
-      <w:proofErr w:type="spellStart"/>
-      <w:r>
-        <w:rPr>
-          <w:rFonts w:cs="B Nazanin"/>
-          <w:sz w:val="28"/>
-          <w:szCs w:val="28"/>
-        </w:rPr>
-        <w:t>testuser</w:t>
-      </w:r>
-      <w:proofErr w:type="spellEnd"/>
+        <w:t xml:space="preserve">  "username": "testuser",</w:t>
+      </w:r>
+    </w:p>
+    <w:p>
+      <w:pPr>
+        <w:rPr>
+          <w:rFonts w:cs="B Nazanin"/>
+          <w:sz w:val="28"/>
+          <w:szCs w:val="28"/>
+        </w:rPr>
+      </w:pPr>
+      <w:r>
+        <w:rPr>
+          <w:rFonts w:cs="B Nazanin"/>
+          <w:sz w:val="28"/>
+          <w:szCs w:val="28"/>
+        </w:rPr>
+        <w:t xml:space="preserve">  "email": "test@example.com",</w:t>
+      </w:r>
+    </w:p>
+    <w:p>
+      <w:pPr>
+        <w:rPr>
+          <w:rFonts w:cs="B Nazanin"/>
+          <w:sz w:val="28"/>
+          <w:szCs w:val="28"/>
+        </w:rPr>
+      </w:pPr>
+      <w:r>
+        <w:rPr>
+          <w:rFonts w:cs="B Nazanin"/>
+          <w:sz w:val="28"/>
+          <w:szCs w:val="28"/>
+        </w:rPr>
+        <w:t xml:space="preserve">  "password": "Test123!",</w:t>
+      </w:r>
+    </w:p>
+    <w:p>
+      <w:pPr>
+        <w:rPr>
+          <w:rFonts w:cs="B Nazanin"/>
+          <w:sz w:val="28"/>
+          <w:szCs w:val="28"/>
+        </w:rPr>
+      </w:pPr>
+      <w:r>
+        <w:rPr>
+          <w:rFonts w:cs="B Nazanin"/>
+          <w:sz w:val="28"/>
+          <w:szCs w:val="28"/>
+        </w:rPr>
+        <w:t xml:space="preserve">  "password_confirm": "Test123!",</w:t>
+      </w:r>
+    </w:p>
+    <w:p>
+      <w:pPr>
+        <w:rPr>
+          <w:rFonts w:cs="B Nazanin"/>
+          <w:sz w:val="28"/>
+          <w:szCs w:val="28"/>
+          <w:rtl/>
+        </w:rPr>
+      </w:pPr>
+      <w:r>
+        <w:rPr>
+          <w:rFonts w:cs="B Nazanin"/>
+          <w:sz w:val="28"/>
+          <w:szCs w:val="28"/>
+        </w:rPr>
+        <w:t xml:space="preserve">  "first_name": "</w:t>
+      </w:r>
+      <w:r>
+        <w:rPr>
+          <w:rFonts w:cs="B Nazanin"/>
+          <w:sz w:val="28"/>
+          <w:szCs w:val="28"/>
+          <w:rtl/>
+        </w:rPr>
+        <w:t>عل</w:t>
+      </w:r>
+      <w:r>
+        <w:rPr>
+          <w:rFonts w:cs="B Nazanin" w:hint="cs"/>
+          <w:sz w:val="28"/>
+          <w:szCs w:val="28"/>
+          <w:rtl/>
+        </w:rPr>
+        <w:t>ی</w:t>
+      </w:r>
       <w:r>
         <w:rPr>
           <w:rFonts w:cs="B Nazanin"/>
@@ -5434,165 +5380,16 @@
           <w:rFonts w:cs="B Nazanin"/>
           <w:sz w:val="28"/>
           <w:szCs w:val="28"/>
-        </w:rPr>
-      </w:pPr>
-      <w:r>
-        <w:rPr>
-          <w:rFonts w:cs="B Nazanin"/>
-          <w:sz w:val="28"/>
-          <w:szCs w:val="28"/>
-        </w:rPr>
-        <w:t xml:space="preserve">  "email": "test@example.com",</w:t>
-      </w:r>
-    </w:p>
-    <w:p>
-      <w:pPr>
-        <w:rPr>
-          <w:rFonts w:cs="B Nazanin"/>
-          <w:sz w:val="28"/>
-          <w:szCs w:val="28"/>
-        </w:rPr>
-      </w:pPr>
-      <w:r>
-        <w:rPr>
-          <w:rFonts w:cs="B Nazanin"/>
-          <w:sz w:val="28"/>
-          <w:szCs w:val="28"/>
-        </w:rPr>
-        <w:t xml:space="preserve">  "password": "Test123!",</w:t>
-      </w:r>
-    </w:p>
-    <w:p>
-      <w:pPr>
-        <w:rPr>
-          <w:rFonts w:cs="B Nazanin"/>
-          <w:sz w:val="28"/>
-          <w:szCs w:val="28"/>
-        </w:rPr>
-      </w:pPr>
-      <w:r>
-        <w:rPr>
-          <w:rFonts w:cs="B Nazanin"/>
-          <w:sz w:val="28"/>
-          <w:szCs w:val="28"/>
-        </w:rPr>
-        <w:t xml:space="preserve">  "</w:t>
-      </w:r>
-      <w:proofErr w:type="spellStart"/>
-      <w:r>
-        <w:rPr>
-          <w:rFonts w:cs="B Nazanin"/>
-          <w:sz w:val="28"/>
-          <w:szCs w:val="28"/>
-        </w:rPr>
-        <w:t>password_confirm</w:t>
-      </w:r>
-      <w:proofErr w:type="spellEnd"/>
-      <w:r>
-        <w:rPr>
-          <w:rFonts w:cs="B Nazanin"/>
-          <w:sz w:val="28"/>
-          <w:szCs w:val="28"/>
-        </w:rPr>
-        <w:t>": "Test123!",</w:t>
-      </w:r>
-    </w:p>
-    <w:p>
-      <w:pPr>
-        <w:rPr>
-          <w:rFonts w:cs="B Nazanin"/>
-          <w:sz w:val="28"/>
-          <w:szCs w:val="28"/>
-          <w:rtl/>
-        </w:rPr>
-      </w:pPr>
-      <w:r>
-        <w:rPr>
-          <w:rFonts w:cs="B Nazanin"/>
-          <w:sz w:val="28"/>
-          <w:szCs w:val="28"/>
-        </w:rPr>
-        <w:t xml:space="preserve">  "</w:t>
-      </w:r>
-      <w:proofErr w:type="spellStart"/>
-      <w:r>
-        <w:rPr>
-          <w:rFonts w:cs="B Nazanin"/>
-          <w:sz w:val="28"/>
-          <w:szCs w:val="28"/>
-        </w:rPr>
-        <w:t>first_name</w:t>
-      </w:r>
-      <w:proofErr w:type="spellEnd"/>
-      <w:r>
-        <w:rPr>
-          <w:rFonts w:cs="B Nazanin"/>
-          <w:sz w:val="28"/>
-          <w:szCs w:val="28"/>
-        </w:rPr>
-        <w:t>": "</w:t>
-      </w:r>
-      <w:r>
-        <w:rPr>
-          <w:rFonts w:cs="B Nazanin"/>
-          <w:sz w:val="28"/>
-          <w:szCs w:val="28"/>
-          <w:rtl/>
-        </w:rPr>
-        <w:t>عل</w:t>
-      </w:r>
-      <w:r>
-        <w:rPr>
-          <w:rFonts w:cs="B Nazanin" w:hint="cs"/>
-          <w:sz w:val="28"/>
-          <w:szCs w:val="28"/>
-          <w:rtl/>
-        </w:rPr>
-        <w:t>ی</w:t>
-      </w:r>
-      <w:r>
-        <w:rPr>
-          <w:rFonts w:cs="B Nazanin"/>
-          <w:sz w:val="28"/>
-          <w:szCs w:val="28"/>
-        </w:rPr>
-        <w:t>",</w:t>
-      </w:r>
-    </w:p>
-    <w:p>
-      <w:pPr>
-        <w:rPr>
-          <w:rFonts w:cs="B Nazanin"/>
-          <w:sz w:val="28"/>
-          <w:szCs w:val="28"/>
-          <w:rtl/>
-        </w:rPr>
-      </w:pPr>
-      <w:r>
-        <w:rPr>
-          <w:rFonts w:cs="B Nazanin"/>
-          <w:sz w:val="28"/>
-          <w:szCs w:val="28"/>
-        </w:rPr>
-        <w:t xml:space="preserve">  "</w:t>
-      </w:r>
-      <w:proofErr w:type="spellStart"/>
-      <w:r>
-        <w:rPr>
-          <w:rFonts w:cs="B Nazanin"/>
-          <w:sz w:val="28"/>
-          <w:szCs w:val="28"/>
-        </w:rPr>
-        <w:t>last_name</w:t>
-      </w:r>
-      <w:proofErr w:type="spellEnd"/>
-      <w:r>
-        <w:rPr>
-          <w:rFonts w:cs="B Nazanin"/>
-          <w:sz w:val="28"/>
-          <w:szCs w:val="28"/>
-        </w:rPr>
-        <w:t>": "</w:t>
+          <w:rtl/>
+        </w:rPr>
+      </w:pPr>
+      <w:r>
+        <w:rPr>
+          <w:rFonts w:cs="B Nazanin"/>
+          <w:sz w:val="28"/>
+          <w:szCs w:val="28"/>
+        </w:rPr>
+        <w:t xml:space="preserve">  "last_name": "</w:t>
       </w:r>
       <w:r>
         <w:rPr>
@@ -5951,25 +5748,7 @@
           <w:sz w:val="28"/>
           <w:szCs w:val="28"/>
         </w:rPr>
-        <w:t xml:space="preserve"> POST /</w:t>
-      </w:r>
-      <w:proofErr w:type="spellStart"/>
-      <w:r>
-        <w:rPr>
-          <w:rFonts w:cs="B Nazanin"/>
-          <w:sz w:val="28"/>
-          <w:szCs w:val="28"/>
-        </w:rPr>
-        <w:t>api</w:t>
-      </w:r>
-      <w:proofErr w:type="spellEnd"/>
-      <w:r>
-        <w:rPr>
-          <w:rFonts w:cs="B Nazanin"/>
-          <w:sz w:val="28"/>
-          <w:szCs w:val="28"/>
-        </w:rPr>
-        <w:t xml:space="preserve">/users/login/ </w:t>
+        <w:t xml:space="preserve"> POST /api/users/login/ </w:t>
       </w:r>
       <w:r>
         <w:rPr>
@@ -6176,25 +5955,7 @@
           <w:sz w:val="28"/>
           <w:szCs w:val="28"/>
         </w:rPr>
-        <w:t xml:space="preserve">  "username": "</w:t>
-      </w:r>
-      <w:proofErr w:type="spellStart"/>
-      <w:r>
-        <w:rPr>
-          <w:rFonts w:cs="B Nazanin"/>
-          <w:sz w:val="28"/>
-          <w:szCs w:val="28"/>
-        </w:rPr>
-        <w:t>testuser</w:t>
-      </w:r>
-      <w:proofErr w:type="spellEnd"/>
-      <w:r>
-        <w:rPr>
-          <w:rFonts w:cs="B Nazanin"/>
-          <w:sz w:val="28"/>
-          <w:szCs w:val="28"/>
-        </w:rPr>
-        <w:t>",</w:t>
+        <w:t xml:space="preserve">  "username": "testuser",</w:t>
       </w:r>
     </w:p>
     <w:p>
@@ -7929,79 +7690,476 @@
           <w:sz w:val="28"/>
           <w:szCs w:val="28"/>
         </w:rPr>
+        <w:t xml:space="preserve"> bookingsys/          # </w:t>
+      </w:r>
+      <w:r>
+        <w:rPr>
+          <w:rFonts w:cs="B Nazanin"/>
+          <w:sz w:val="28"/>
+          <w:szCs w:val="28"/>
+          <w:rtl/>
+        </w:rPr>
+        <w:t>تنظ</w:t>
+      </w:r>
+      <w:r>
+        <w:rPr>
+          <w:rFonts w:cs="B Nazanin" w:hint="cs"/>
+          <w:sz w:val="28"/>
+          <w:szCs w:val="28"/>
+          <w:rtl/>
+        </w:rPr>
+        <w:t>ی</w:t>
+      </w:r>
+      <w:r>
+        <w:rPr>
+          <w:rFonts w:cs="B Nazanin" w:hint="eastAsia"/>
+          <w:sz w:val="28"/>
+          <w:szCs w:val="28"/>
+          <w:rtl/>
+        </w:rPr>
+        <w:t>مات</w:t>
+      </w:r>
+      <w:r>
+        <w:rPr>
+          <w:rFonts w:cs="B Nazanin"/>
+          <w:sz w:val="28"/>
+          <w:szCs w:val="28"/>
+          <w:rtl/>
+        </w:rPr>
+        <w:t xml:space="preserve"> پروژه</w:t>
+      </w:r>
+    </w:p>
+    <w:p>
+      <w:pPr>
+        <w:rPr>
+          <w:rFonts w:cs="B Nazanin"/>
+          <w:sz w:val="28"/>
+          <w:szCs w:val="28"/>
+        </w:rPr>
+      </w:pPr>
+      <w:r>
+        <w:rPr>
+          <w:rFonts w:cs="B Nazanin"/>
+          <w:sz w:val="28"/>
+          <w:szCs w:val="28"/>
+        </w:rPr>
+        <w:t xml:space="preserve">│   </w:t>
+      </w:r>
+      <w:r>
+        <w:rPr>
+          <w:rFonts w:ascii="Arial" w:hAnsi="Arial" w:cs="B Nazanin"/>
+          <w:sz w:val="28"/>
+          <w:szCs w:val="28"/>
+        </w:rPr>
+        <w:t>├</w:t>
+      </w:r>
+      <w:r>
+        <w:rPr>
+          <w:rFonts w:ascii="Calibri" w:hAnsi="Calibri" w:cs="B Nazanin"/>
+          <w:sz w:val="28"/>
+          <w:szCs w:val="28"/>
+        </w:rPr>
+        <w:t>──</w:t>
+      </w:r>
+      <w:r>
+        <w:rPr>
+          <w:rFonts w:cs="B Nazanin"/>
+          <w:sz w:val="28"/>
+          <w:szCs w:val="28"/>
+        </w:rPr>
+        <w:t xml:space="preserve"> settings.py</w:t>
+      </w:r>
+    </w:p>
+    <w:p>
+      <w:pPr>
+        <w:rPr>
+          <w:rFonts w:cs="B Nazanin"/>
+          <w:sz w:val="28"/>
+          <w:szCs w:val="28"/>
+        </w:rPr>
+      </w:pPr>
+      <w:r>
+        <w:rPr>
+          <w:rFonts w:cs="B Nazanin"/>
+          <w:sz w:val="28"/>
+          <w:szCs w:val="28"/>
+        </w:rPr>
+        <w:t xml:space="preserve">│   </w:t>
+      </w:r>
+      <w:r>
+        <w:rPr>
+          <w:rFonts w:ascii="Arial" w:hAnsi="Arial" w:cs="B Nazanin"/>
+          <w:sz w:val="28"/>
+          <w:szCs w:val="28"/>
+        </w:rPr>
+        <w:t>├</w:t>
+      </w:r>
+      <w:r>
+        <w:rPr>
+          <w:rFonts w:ascii="Calibri" w:hAnsi="Calibri" w:cs="B Nazanin"/>
+          <w:sz w:val="28"/>
+          <w:szCs w:val="28"/>
+        </w:rPr>
+        <w:t>──</w:t>
+      </w:r>
+      <w:r>
+        <w:rPr>
+          <w:rFonts w:cs="B Nazanin"/>
+          <w:sz w:val="28"/>
+          <w:szCs w:val="28"/>
+        </w:rPr>
+        <w:t xml:space="preserve"> urls.py</w:t>
+      </w:r>
+    </w:p>
+    <w:p>
+      <w:pPr>
+        <w:rPr>
+          <w:rFonts w:cs="B Nazanin"/>
+          <w:sz w:val="28"/>
+          <w:szCs w:val="28"/>
+        </w:rPr>
+      </w:pPr>
+      <w:r>
+        <w:rPr>
+          <w:rFonts w:cs="B Nazanin"/>
+          <w:sz w:val="28"/>
+          <w:szCs w:val="28"/>
+        </w:rPr>
+        <w:t>│   └── wsgi.py</w:t>
+      </w:r>
+    </w:p>
+    <w:p>
+      <w:pPr>
+        <w:rPr>
+          <w:rFonts w:cs="B Nazanin"/>
+          <w:sz w:val="28"/>
+          <w:szCs w:val="28"/>
+          <w:rtl/>
+        </w:rPr>
+      </w:pPr>
+      <w:r>
+        <w:rPr>
+          <w:rFonts w:ascii="Arial" w:hAnsi="Arial" w:cs="B Nazanin"/>
+          <w:sz w:val="28"/>
+          <w:szCs w:val="28"/>
+        </w:rPr>
+        <w:t>├</w:t>
+      </w:r>
+      <w:r>
+        <w:rPr>
+          <w:rFonts w:ascii="Calibri" w:hAnsi="Calibri" w:cs="B Nazanin"/>
+          <w:sz w:val="28"/>
+          <w:szCs w:val="28"/>
+        </w:rPr>
+        <w:t>──</w:t>
+      </w:r>
+      <w:r>
+        <w:rPr>
+          <w:rFonts w:cs="B Nazanin"/>
+          <w:sz w:val="28"/>
+          <w:szCs w:val="28"/>
+        </w:rPr>
+        <w:t xml:space="preserve"> users/               # </w:t>
+      </w:r>
+      <w:r>
+        <w:rPr>
+          <w:rFonts w:cs="B Nazanin"/>
+          <w:sz w:val="28"/>
+          <w:szCs w:val="28"/>
+          <w:rtl/>
+        </w:rPr>
+        <w:t>اپ مد</w:t>
+      </w:r>
+      <w:r>
+        <w:rPr>
+          <w:rFonts w:cs="B Nazanin" w:hint="cs"/>
+          <w:sz w:val="28"/>
+          <w:szCs w:val="28"/>
+          <w:rtl/>
+        </w:rPr>
+        <w:t>ی</w:t>
+      </w:r>
+      <w:r>
+        <w:rPr>
+          <w:rFonts w:cs="B Nazanin" w:hint="eastAsia"/>
+          <w:sz w:val="28"/>
+          <w:szCs w:val="28"/>
+          <w:rtl/>
+        </w:rPr>
+        <w:t>ر</w:t>
+      </w:r>
+      <w:r>
+        <w:rPr>
+          <w:rFonts w:cs="B Nazanin" w:hint="cs"/>
+          <w:sz w:val="28"/>
+          <w:szCs w:val="28"/>
+          <w:rtl/>
+        </w:rPr>
+        <w:t>ی</w:t>
+      </w:r>
+      <w:r>
+        <w:rPr>
+          <w:rFonts w:cs="B Nazanin" w:hint="eastAsia"/>
+          <w:sz w:val="28"/>
+          <w:szCs w:val="28"/>
+          <w:rtl/>
+        </w:rPr>
+        <w:t>ت</w:t>
+      </w:r>
+      <w:r>
+        <w:rPr>
+          <w:rFonts w:cs="B Nazanin"/>
+          <w:sz w:val="28"/>
+          <w:szCs w:val="28"/>
+          <w:rtl/>
+        </w:rPr>
+        <w:t xml:space="preserve"> کاربران</w:t>
+      </w:r>
+    </w:p>
+    <w:p>
+      <w:pPr>
+        <w:rPr>
+          <w:rFonts w:cs="B Nazanin"/>
+          <w:sz w:val="28"/>
+          <w:szCs w:val="28"/>
+          <w:rtl/>
+        </w:rPr>
+      </w:pPr>
+      <w:r>
+        <w:rPr>
+          <w:rFonts w:ascii="Arial" w:hAnsi="Arial" w:cs="B Nazanin"/>
+          <w:sz w:val="28"/>
+          <w:szCs w:val="28"/>
+        </w:rPr>
+        <w:t>├</w:t>
+      </w:r>
+      <w:r>
+        <w:rPr>
+          <w:rFonts w:ascii="Calibri" w:hAnsi="Calibri" w:cs="B Nazanin"/>
+          <w:sz w:val="28"/>
+          <w:szCs w:val="28"/>
+        </w:rPr>
+        <w:t>──</w:t>
+      </w:r>
+      <w:r>
+        <w:rPr>
+          <w:rFonts w:cs="B Nazanin"/>
+          <w:sz w:val="28"/>
+          <w:szCs w:val="28"/>
+        </w:rPr>
+        <w:t xml:space="preserve"> services/            # </w:t>
+      </w:r>
+      <w:r>
+        <w:rPr>
+          <w:rFonts w:cs="B Nazanin"/>
+          <w:sz w:val="28"/>
+          <w:szCs w:val="28"/>
+          <w:rtl/>
+        </w:rPr>
+        <w:t>اپ مد</w:t>
+      </w:r>
+      <w:r>
+        <w:rPr>
+          <w:rFonts w:cs="B Nazanin" w:hint="cs"/>
+          <w:sz w:val="28"/>
+          <w:szCs w:val="28"/>
+          <w:rtl/>
+        </w:rPr>
+        <w:t>ی</w:t>
+      </w:r>
+      <w:r>
+        <w:rPr>
+          <w:rFonts w:cs="B Nazanin" w:hint="eastAsia"/>
+          <w:sz w:val="28"/>
+          <w:szCs w:val="28"/>
+          <w:rtl/>
+        </w:rPr>
+        <w:t>ر</w:t>
+      </w:r>
+      <w:r>
+        <w:rPr>
+          <w:rFonts w:cs="B Nazanin" w:hint="cs"/>
+          <w:sz w:val="28"/>
+          <w:szCs w:val="28"/>
+          <w:rtl/>
+        </w:rPr>
+        <w:t>ی</w:t>
+      </w:r>
+      <w:r>
+        <w:rPr>
+          <w:rFonts w:cs="B Nazanin" w:hint="eastAsia"/>
+          <w:sz w:val="28"/>
+          <w:szCs w:val="28"/>
+          <w:rtl/>
+        </w:rPr>
+        <w:t>ت</w:t>
+      </w:r>
+      <w:r>
+        <w:rPr>
+          <w:rFonts w:cs="B Nazanin"/>
+          <w:sz w:val="28"/>
+          <w:szCs w:val="28"/>
+          <w:rtl/>
+        </w:rPr>
+        <w:t xml:space="preserve"> سرو</w:t>
+      </w:r>
+      <w:r>
+        <w:rPr>
+          <w:rFonts w:cs="B Nazanin" w:hint="cs"/>
+          <w:sz w:val="28"/>
+          <w:szCs w:val="28"/>
+          <w:rtl/>
+        </w:rPr>
+        <w:t>ی</w:t>
+      </w:r>
+      <w:r>
+        <w:rPr>
+          <w:rFonts w:cs="B Nazanin" w:hint="eastAsia"/>
+          <w:sz w:val="28"/>
+          <w:szCs w:val="28"/>
+          <w:rtl/>
+        </w:rPr>
+        <w:t>س‌ها</w:t>
+      </w:r>
+    </w:p>
+    <w:p>
+      <w:pPr>
+        <w:rPr>
+          <w:rFonts w:cs="B Nazanin"/>
+          <w:sz w:val="28"/>
+          <w:szCs w:val="28"/>
+          <w:rtl/>
+        </w:rPr>
+      </w:pPr>
+      <w:r>
+        <w:rPr>
+          <w:rFonts w:ascii="Arial" w:hAnsi="Arial" w:cs="B Nazanin"/>
+          <w:sz w:val="28"/>
+          <w:szCs w:val="28"/>
+        </w:rPr>
+        <w:t>├</w:t>
+      </w:r>
+      <w:r>
+        <w:rPr>
+          <w:rFonts w:ascii="Calibri" w:hAnsi="Calibri" w:cs="B Nazanin"/>
+          <w:sz w:val="28"/>
+          <w:szCs w:val="28"/>
+        </w:rPr>
+        <w:t>──</w:t>
+      </w:r>
+      <w:r>
+        <w:rPr>
+          <w:rFonts w:cs="B Nazanin"/>
+          <w:sz w:val="28"/>
+          <w:szCs w:val="28"/>
+        </w:rPr>
+        <w:t xml:space="preserve"> bookings/            # </w:t>
+      </w:r>
+      <w:r>
+        <w:rPr>
+          <w:rFonts w:cs="B Nazanin"/>
+          <w:sz w:val="28"/>
+          <w:szCs w:val="28"/>
+          <w:rtl/>
+        </w:rPr>
+        <w:t>اپ رزرو و پرداخت</w:t>
+      </w:r>
+    </w:p>
+    <w:p>
+      <w:pPr>
+        <w:rPr>
+          <w:rFonts w:cs="B Nazanin"/>
+          <w:sz w:val="28"/>
+          <w:szCs w:val="28"/>
+          <w:rtl/>
+        </w:rPr>
+      </w:pPr>
+      <w:r>
+        <w:rPr>
+          <w:rFonts w:ascii="Arial" w:hAnsi="Arial" w:cs="B Nazanin"/>
+          <w:sz w:val="28"/>
+          <w:szCs w:val="28"/>
+        </w:rPr>
+        <w:t>├</w:t>
+      </w:r>
+      <w:r>
+        <w:rPr>
+          <w:rFonts w:ascii="Calibri" w:hAnsi="Calibri" w:cs="B Nazanin"/>
+          <w:sz w:val="28"/>
+          <w:szCs w:val="28"/>
+        </w:rPr>
+        <w:t>──</w:t>
+      </w:r>
+      <w:r>
+        <w:rPr>
+          <w:rFonts w:cs="B Nazanin"/>
+          <w:sz w:val="28"/>
+          <w:szCs w:val="28"/>
+        </w:rPr>
+        <w:t xml:space="preserve"> templates/           # </w:t>
+      </w:r>
+      <w:r>
+        <w:rPr>
+          <w:rFonts w:cs="B Nazanin"/>
+          <w:sz w:val="28"/>
+          <w:szCs w:val="28"/>
+          <w:rtl/>
+        </w:rPr>
+        <w:t>تمپل</w:t>
+      </w:r>
+      <w:r>
+        <w:rPr>
+          <w:rFonts w:cs="B Nazanin" w:hint="cs"/>
+          <w:sz w:val="28"/>
+          <w:szCs w:val="28"/>
+          <w:rtl/>
+        </w:rPr>
+        <w:t>ی</w:t>
+      </w:r>
+      <w:r>
+        <w:rPr>
+          <w:rFonts w:cs="B Nazanin" w:hint="eastAsia"/>
+          <w:sz w:val="28"/>
+          <w:szCs w:val="28"/>
+          <w:rtl/>
+        </w:rPr>
+        <w:t>ت‌ها</w:t>
+      </w:r>
+      <w:r>
+        <w:rPr>
+          <w:rFonts w:cs="B Nazanin" w:hint="cs"/>
+          <w:sz w:val="28"/>
+          <w:szCs w:val="28"/>
+          <w:rtl/>
+        </w:rPr>
+        <w:t>ی</w:t>
+      </w:r>
+      <w:r>
+        <w:rPr>
+          <w:rFonts w:cs="B Nazanin"/>
+          <w:sz w:val="28"/>
+          <w:szCs w:val="28"/>
+        </w:rPr>
         <w:t xml:space="preserve"> </w:t>
       </w:r>
-      <w:proofErr w:type="spellStart"/>
-      <w:r>
-        <w:rPr>
-          <w:rFonts w:cs="B Nazanin"/>
-          <w:sz w:val="28"/>
-          <w:szCs w:val="28"/>
-        </w:rPr>
-        <w:t>bookingsys</w:t>
-      </w:r>
-      <w:proofErr w:type="spellEnd"/>
-      <w:r>
-        <w:rPr>
-          <w:rFonts w:cs="B Nazanin"/>
-          <w:sz w:val="28"/>
-          <w:szCs w:val="28"/>
-        </w:rPr>
-        <w:t xml:space="preserve">/          # </w:t>
-      </w:r>
-      <w:r>
-        <w:rPr>
-          <w:rFonts w:cs="B Nazanin"/>
-          <w:sz w:val="28"/>
-          <w:szCs w:val="28"/>
-          <w:rtl/>
-        </w:rPr>
-        <w:t>تنظ</w:t>
-      </w:r>
-      <w:r>
-        <w:rPr>
-          <w:rFonts w:cs="B Nazanin" w:hint="cs"/>
-          <w:sz w:val="28"/>
-          <w:szCs w:val="28"/>
-          <w:rtl/>
-        </w:rPr>
-        <w:t>ی</w:t>
-      </w:r>
-      <w:r>
-        <w:rPr>
-          <w:rFonts w:cs="B Nazanin" w:hint="eastAsia"/>
-          <w:sz w:val="28"/>
-          <w:szCs w:val="28"/>
-          <w:rtl/>
-        </w:rPr>
-        <w:t>مات</w:t>
-      </w:r>
-      <w:r>
-        <w:rPr>
-          <w:rFonts w:cs="B Nazanin"/>
-          <w:sz w:val="28"/>
-          <w:szCs w:val="28"/>
-          <w:rtl/>
-        </w:rPr>
-        <w:t xml:space="preserve"> پروژه</w:t>
-      </w:r>
-    </w:p>
-    <w:p>
-      <w:pPr>
-        <w:rPr>
-          <w:rFonts w:cs="B Nazanin"/>
-          <w:sz w:val="28"/>
-          <w:szCs w:val="28"/>
-        </w:rPr>
-      </w:pPr>
-      <w:r>
-        <w:rPr>
-          <w:rFonts w:cs="B Nazanin"/>
-          <w:sz w:val="28"/>
-          <w:szCs w:val="28"/>
-        </w:rPr>
-        <w:t xml:space="preserve">│   </w:t>
-      </w:r>
+      <w:r>
+        <w:rPr>
+          <w:rFonts w:cs="B Nazanin"/>
+          <w:sz w:val="28"/>
+          <w:szCs w:val="28"/>
+        </w:rPr>
+        <w:t>html</w:t>
+      </w:r>
+    </w:p>
+    <w:p>
+      <w:pPr>
+        <w:rPr>
+          <w:rFonts w:cs="B Nazanin"/>
+          <w:sz w:val="28"/>
+          <w:szCs w:val="28"/>
+          <w:rtl/>
+        </w:rPr>
+      </w:pPr>
       <w:r>
         <w:rPr>
           <w:rFonts w:ascii="Arial" w:hAnsi="Arial" w:cs="B Nazanin"/>
@@ -8024,379 +8182,6 @@
           <w:sz w:val="28"/>
           <w:szCs w:val="28"/>
         </w:rPr>
-        <w:t xml:space="preserve"> settings.py</w:t>
-      </w:r>
-    </w:p>
-    <w:p>
-      <w:pPr>
-        <w:rPr>
-          <w:rFonts w:cs="B Nazanin"/>
-          <w:sz w:val="28"/>
-          <w:szCs w:val="28"/>
-        </w:rPr>
-      </w:pPr>
-      <w:r>
-        <w:rPr>
-          <w:rFonts w:cs="B Nazanin"/>
-          <w:sz w:val="28"/>
-          <w:szCs w:val="28"/>
-        </w:rPr>
-        <w:t xml:space="preserve">│   </w:t>
-      </w:r>
-      <w:r>
-        <w:rPr>
-          <w:rFonts w:ascii="Arial" w:hAnsi="Arial" w:cs="B Nazanin"/>
-          <w:sz w:val="28"/>
-          <w:szCs w:val="28"/>
-        </w:rPr>
-        <w:t>├</w:t>
-      </w:r>
-      <w:r>
-        <w:rPr>
-          <w:rFonts w:ascii="Calibri" w:hAnsi="Calibri" w:cs="B Nazanin"/>
-          <w:sz w:val="28"/>
-          <w:szCs w:val="28"/>
-        </w:rPr>
-        <w:t>──</w:t>
-      </w:r>
-      <w:r>
-        <w:rPr>
-          <w:rFonts w:cs="B Nazanin"/>
-          <w:sz w:val="28"/>
-          <w:szCs w:val="28"/>
-        </w:rPr>
-        <w:t xml:space="preserve"> urls.py</w:t>
-      </w:r>
-    </w:p>
-    <w:p>
-      <w:pPr>
-        <w:rPr>
-          <w:rFonts w:cs="B Nazanin"/>
-          <w:sz w:val="28"/>
-          <w:szCs w:val="28"/>
-        </w:rPr>
-      </w:pPr>
-      <w:r>
-        <w:rPr>
-          <w:rFonts w:cs="B Nazanin"/>
-          <w:sz w:val="28"/>
-          <w:szCs w:val="28"/>
-        </w:rPr>
-        <w:t>│   └── wsgi.py</w:t>
-      </w:r>
-    </w:p>
-    <w:p>
-      <w:pPr>
-        <w:rPr>
-          <w:rFonts w:cs="B Nazanin"/>
-          <w:sz w:val="28"/>
-          <w:szCs w:val="28"/>
-          <w:rtl/>
-        </w:rPr>
-      </w:pPr>
-      <w:r>
-        <w:rPr>
-          <w:rFonts w:ascii="Arial" w:hAnsi="Arial" w:cs="B Nazanin"/>
-          <w:sz w:val="28"/>
-          <w:szCs w:val="28"/>
-        </w:rPr>
-        <w:t>├</w:t>
-      </w:r>
-      <w:r>
-        <w:rPr>
-          <w:rFonts w:ascii="Calibri" w:hAnsi="Calibri" w:cs="B Nazanin"/>
-          <w:sz w:val="28"/>
-          <w:szCs w:val="28"/>
-        </w:rPr>
-        <w:t>──</w:t>
-      </w:r>
-      <w:r>
-        <w:rPr>
-          <w:rFonts w:cs="B Nazanin"/>
-          <w:sz w:val="28"/>
-          <w:szCs w:val="28"/>
-        </w:rPr>
-        <w:t xml:space="preserve"> users/               # </w:t>
-      </w:r>
-      <w:r>
-        <w:rPr>
-          <w:rFonts w:cs="B Nazanin"/>
-          <w:sz w:val="28"/>
-          <w:szCs w:val="28"/>
-          <w:rtl/>
-        </w:rPr>
-        <w:t>اپ مد</w:t>
-      </w:r>
-      <w:r>
-        <w:rPr>
-          <w:rFonts w:cs="B Nazanin" w:hint="cs"/>
-          <w:sz w:val="28"/>
-          <w:szCs w:val="28"/>
-          <w:rtl/>
-        </w:rPr>
-        <w:t>ی</w:t>
-      </w:r>
-      <w:r>
-        <w:rPr>
-          <w:rFonts w:cs="B Nazanin" w:hint="eastAsia"/>
-          <w:sz w:val="28"/>
-          <w:szCs w:val="28"/>
-          <w:rtl/>
-        </w:rPr>
-        <w:t>ر</w:t>
-      </w:r>
-      <w:r>
-        <w:rPr>
-          <w:rFonts w:cs="B Nazanin" w:hint="cs"/>
-          <w:sz w:val="28"/>
-          <w:szCs w:val="28"/>
-          <w:rtl/>
-        </w:rPr>
-        <w:t>ی</w:t>
-      </w:r>
-      <w:r>
-        <w:rPr>
-          <w:rFonts w:cs="B Nazanin" w:hint="eastAsia"/>
-          <w:sz w:val="28"/>
-          <w:szCs w:val="28"/>
-          <w:rtl/>
-        </w:rPr>
-        <w:t>ت</w:t>
-      </w:r>
-      <w:r>
-        <w:rPr>
-          <w:rFonts w:cs="B Nazanin"/>
-          <w:sz w:val="28"/>
-          <w:szCs w:val="28"/>
-          <w:rtl/>
-        </w:rPr>
-        <w:t xml:space="preserve"> کاربران</w:t>
-      </w:r>
-    </w:p>
-    <w:p>
-      <w:pPr>
-        <w:rPr>
-          <w:rFonts w:cs="B Nazanin"/>
-          <w:sz w:val="28"/>
-          <w:szCs w:val="28"/>
-          <w:rtl/>
-        </w:rPr>
-      </w:pPr>
-      <w:r>
-        <w:rPr>
-          <w:rFonts w:ascii="Arial" w:hAnsi="Arial" w:cs="B Nazanin"/>
-          <w:sz w:val="28"/>
-          <w:szCs w:val="28"/>
-        </w:rPr>
-        <w:t>├</w:t>
-      </w:r>
-      <w:r>
-        <w:rPr>
-          <w:rFonts w:ascii="Calibri" w:hAnsi="Calibri" w:cs="B Nazanin"/>
-          <w:sz w:val="28"/>
-          <w:szCs w:val="28"/>
-        </w:rPr>
-        <w:t>──</w:t>
-      </w:r>
-      <w:r>
-        <w:rPr>
-          <w:rFonts w:cs="B Nazanin"/>
-          <w:sz w:val="28"/>
-          <w:szCs w:val="28"/>
-        </w:rPr>
-        <w:t xml:space="preserve"> services/            # </w:t>
-      </w:r>
-      <w:r>
-        <w:rPr>
-          <w:rFonts w:cs="B Nazanin"/>
-          <w:sz w:val="28"/>
-          <w:szCs w:val="28"/>
-          <w:rtl/>
-        </w:rPr>
-        <w:t>اپ مد</w:t>
-      </w:r>
-      <w:r>
-        <w:rPr>
-          <w:rFonts w:cs="B Nazanin" w:hint="cs"/>
-          <w:sz w:val="28"/>
-          <w:szCs w:val="28"/>
-          <w:rtl/>
-        </w:rPr>
-        <w:t>ی</w:t>
-      </w:r>
-      <w:r>
-        <w:rPr>
-          <w:rFonts w:cs="B Nazanin" w:hint="eastAsia"/>
-          <w:sz w:val="28"/>
-          <w:szCs w:val="28"/>
-          <w:rtl/>
-        </w:rPr>
-        <w:t>ر</w:t>
-      </w:r>
-      <w:r>
-        <w:rPr>
-          <w:rFonts w:cs="B Nazanin" w:hint="cs"/>
-          <w:sz w:val="28"/>
-          <w:szCs w:val="28"/>
-          <w:rtl/>
-        </w:rPr>
-        <w:t>ی</w:t>
-      </w:r>
-      <w:r>
-        <w:rPr>
-          <w:rFonts w:cs="B Nazanin" w:hint="eastAsia"/>
-          <w:sz w:val="28"/>
-          <w:szCs w:val="28"/>
-          <w:rtl/>
-        </w:rPr>
-        <w:t>ت</w:t>
-      </w:r>
-      <w:r>
-        <w:rPr>
-          <w:rFonts w:cs="B Nazanin"/>
-          <w:sz w:val="28"/>
-          <w:szCs w:val="28"/>
-          <w:rtl/>
-        </w:rPr>
-        <w:t xml:space="preserve"> سرو</w:t>
-      </w:r>
-      <w:r>
-        <w:rPr>
-          <w:rFonts w:cs="B Nazanin" w:hint="cs"/>
-          <w:sz w:val="28"/>
-          <w:szCs w:val="28"/>
-          <w:rtl/>
-        </w:rPr>
-        <w:t>ی</w:t>
-      </w:r>
-      <w:r>
-        <w:rPr>
-          <w:rFonts w:cs="B Nazanin" w:hint="eastAsia"/>
-          <w:sz w:val="28"/>
-          <w:szCs w:val="28"/>
-          <w:rtl/>
-        </w:rPr>
-        <w:t>س‌ها</w:t>
-      </w:r>
-    </w:p>
-    <w:p>
-      <w:pPr>
-        <w:rPr>
-          <w:rFonts w:cs="B Nazanin"/>
-          <w:sz w:val="28"/>
-          <w:szCs w:val="28"/>
-          <w:rtl/>
-        </w:rPr>
-      </w:pPr>
-      <w:r>
-        <w:rPr>
-          <w:rFonts w:ascii="Arial" w:hAnsi="Arial" w:cs="B Nazanin"/>
-          <w:sz w:val="28"/>
-          <w:szCs w:val="28"/>
-        </w:rPr>
-        <w:t>├</w:t>
-      </w:r>
-      <w:r>
-        <w:rPr>
-          <w:rFonts w:ascii="Calibri" w:hAnsi="Calibri" w:cs="B Nazanin"/>
-          <w:sz w:val="28"/>
-          <w:szCs w:val="28"/>
-        </w:rPr>
-        <w:t>──</w:t>
-      </w:r>
-      <w:r>
-        <w:rPr>
-          <w:rFonts w:cs="B Nazanin"/>
-          <w:sz w:val="28"/>
-          <w:szCs w:val="28"/>
-        </w:rPr>
-        <w:t xml:space="preserve"> bookings/            # </w:t>
-      </w:r>
-      <w:r>
-        <w:rPr>
-          <w:rFonts w:cs="B Nazanin"/>
-          <w:sz w:val="28"/>
-          <w:szCs w:val="28"/>
-          <w:rtl/>
-        </w:rPr>
-        <w:t>اپ رزرو و پرداخت</w:t>
-      </w:r>
-    </w:p>
-    <w:p>
-      <w:pPr>
-        <w:rPr>
-          <w:rFonts w:cs="B Nazanin"/>
-          <w:sz w:val="28"/>
-          <w:szCs w:val="28"/>
-          <w:rtl/>
-        </w:rPr>
-      </w:pPr>
-      <w:r>
-        <w:rPr>
-          <w:rFonts w:ascii="Arial" w:hAnsi="Arial" w:cs="B Nazanin"/>
-          <w:sz w:val="28"/>
-          <w:szCs w:val="28"/>
-        </w:rPr>
-        <w:t>├</w:t>
-      </w:r>
-      <w:r>
-        <w:rPr>
-          <w:rFonts w:ascii="Calibri" w:hAnsi="Calibri" w:cs="B Nazanin"/>
-          <w:sz w:val="28"/>
-          <w:szCs w:val="28"/>
-        </w:rPr>
-        <w:t>──</w:t>
-      </w:r>
-      <w:r>
-        <w:rPr>
-          <w:rFonts w:cs="B Nazanin"/>
-          <w:sz w:val="28"/>
-          <w:szCs w:val="28"/>
-        </w:rPr>
-        <w:t xml:space="preserve"> templates/           # </w:t>
-      </w:r>
-      <w:r>
-        <w:rPr>
-          <w:rFonts w:cs="B Nazanin"/>
-          <w:sz w:val="28"/>
-          <w:szCs w:val="28"/>
-          <w:rtl/>
-        </w:rPr>
-        <w:t>تمپل</w:t>
-      </w:r>
-      <w:r>
-        <w:rPr>
-          <w:rFonts w:cs="B Nazanin" w:hint="cs"/>
-          <w:sz w:val="28"/>
-          <w:szCs w:val="28"/>
-          <w:rtl/>
-        </w:rPr>
-        <w:t>ی</w:t>
-      </w:r>
-      <w:r>
-        <w:rPr>
-          <w:rFonts w:cs="B Nazanin" w:hint="eastAsia"/>
-          <w:sz w:val="28"/>
-          <w:szCs w:val="28"/>
-          <w:rtl/>
-        </w:rPr>
-        <w:t>ت‌ها</w:t>
-      </w:r>
-      <w:r>
-        <w:rPr>
-          <w:rFonts w:cs="B Nazanin" w:hint="cs"/>
-          <w:sz w:val="28"/>
-          <w:szCs w:val="28"/>
-          <w:rtl/>
-        </w:rPr>
-        <w:t>ی</w:t>
-      </w:r>
-      <w:r>
-        <w:rPr>
-          <w:rFonts w:cs="B Nazanin"/>
-          <w:sz w:val="28"/>
-          <w:szCs w:val="28"/>
-        </w:rPr>
         <w:t xml:space="preserve"> </w:t>
       </w:r>
       <w:r>
@@ -8405,48 +8190,6 @@
           <w:sz w:val="28"/>
           <w:szCs w:val="28"/>
         </w:rPr>
-        <w:t>html</w:t>
-      </w:r>
-    </w:p>
-    <w:p>
-      <w:pPr>
-        <w:rPr>
-          <w:rFonts w:cs="B Nazanin"/>
-          <w:sz w:val="28"/>
-          <w:szCs w:val="28"/>
-          <w:rtl/>
-        </w:rPr>
-      </w:pPr>
-      <w:r>
-        <w:rPr>
-          <w:rFonts w:ascii="Arial" w:hAnsi="Arial" w:cs="B Nazanin"/>
-          <w:sz w:val="28"/>
-          <w:szCs w:val="28"/>
-        </w:rPr>
-        <w:t>├</w:t>
-      </w:r>
-      <w:r>
-        <w:rPr>
-          <w:rFonts w:ascii="Calibri" w:hAnsi="Calibri" w:cs="B Nazanin"/>
-          <w:sz w:val="28"/>
-          <w:szCs w:val="28"/>
-        </w:rPr>
-        <w:t>──</w:t>
-      </w:r>
-      <w:r>
-        <w:rPr>
-          <w:rFonts w:cs="B Nazanin"/>
-          <w:sz w:val="28"/>
-          <w:szCs w:val="28"/>
-        </w:rPr>
-        <w:t xml:space="preserve"> </w:t>
-      </w:r>
-      <w:r>
-        <w:rPr>
-          <w:rFonts w:cs="B Nazanin"/>
-          <w:sz w:val="28"/>
-          <w:szCs w:val="28"/>
-        </w:rPr>
         <w:t>statics</w:t>
       </w:r>
       <w:r>
@@ -8457,34 +8200,14 @@
         </w:rPr>
         <w:t xml:space="preserve">/               # </w:t>
       </w:r>
-      <w:proofErr w:type="spellStart"/>
-      <w:r>
-        <w:rPr>
-          <w:rFonts w:cs="B Nazanin"/>
-          <w:sz w:val="28"/>
-          <w:szCs w:val="28"/>
-        </w:rPr>
-        <w:t>js</w:t>
-      </w:r>
-      <w:proofErr w:type="spellEnd"/>
-      <w:r>
-        <w:rPr>
-          <w:rFonts w:cs="B Nazanin"/>
-          <w:sz w:val="28"/>
-          <w:szCs w:val="28"/>
-        </w:rPr>
-        <w:t xml:space="preserve">, </w:t>
-      </w:r>
-      <w:proofErr w:type="spellStart"/>
-      <w:r>
-        <w:rPr>
-          <w:rFonts w:cs="B Nazanin"/>
-          <w:sz w:val="28"/>
-          <w:szCs w:val="28"/>
-        </w:rPr>
-        <w:t>css</w:t>
-      </w:r>
-      <w:proofErr w:type="spellEnd"/>
+      <w:r>
+        <w:rPr>
+          <w:rFonts w:cs="B Nazanin"/>
+          <w:sz w:val="28"/>
+          <w:szCs w:val="28"/>
+        </w:rPr>
+        <w:t>js, css</w:t>
+      </w:r>
     </w:p>
     <w:p>
       <w:pPr>
@@ -9141,27 +8864,7 @@
           <w:szCs w:val="28"/>
           <w:lang w:bidi="fa-IR"/>
         </w:rPr>
-        <w:t xml:space="preserve"> python manage.py </w:t>
-      </w:r>
-      <w:proofErr w:type="spellStart"/>
-      <w:r>
-        <w:rPr>
-          <w:rFonts w:cs="B Nazanin"/>
-          <w:sz w:val="28"/>
-          <w:szCs w:val="28"/>
-          <w:lang w:bidi="fa-IR"/>
-        </w:rPr>
-        <w:t>runserver</w:t>
-      </w:r>
-      <w:proofErr w:type="spellEnd"/>
-      <w:r>
-        <w:rPr>
-          <w:rFonts w:cs="B Nazanin"/>
-          <w:sz w:val="28"/>
-          <w:szCs w:val="28"/>
-          <w:lang w:bidi="fa-IR"/>
-        </w:rPr>
-        <w:t xml:space="preserve"> </w:t>
+        <w:t xml:space="preserve"> python manage.py runserver </w:t>
       </w:r>
       <w:r>
         <w:rPr>

</xml_diff>